<commit_message>
fix and add bd script
</commit_message>
<xml_diff>
--- a/docs/Спецификация.docx
+++ b/docs/Спецификация.docx
@@ -5,7 +5,7 @@
     <w:p>
       <w:pPr>
         <w:pStyle w:val="1"/>
-        <w:spacing w:before="0"/>
+        <w:spacing w:before="0" w:line="360" w:lineRule="auto"/>
         <w:jc w:val="center"/>
         <w:rPr>
           <w:rFonts w:ascii="Times New Roman" w:hAnsi="Times New Roman" w:cs="Times New Roman"/>
@@ -39,62 +39,9 @@
     </w:p>
     <w:p>
       <w:pPr>
-        <w:rPr>
-          <w:rFonts w:ascii="Times New Roman" w:hAnsi="Times New Roman" w:cs="Times New Roman"/>
-          <w:lang w:val="ru-RU"/>
-        </w:rPr>
-      </w:pPr>
-    </w:p>
-    <w:p>
-      <w:pPr>
-        <w:rPr>
-          <w:rFonts w:ascii="Times New Roman" w:hAnsi="Times New Roman" w:cs="Times New Roman"/>
-          <w:sz w:val="28"/>
-          <w:szCs w:val="28"/>
-          <w:lang w:val="ru-RU"/>
-        </w:rPr>
-      </w:pPr>
-      <w:r>
-        <w:rPr>
-          <w:rFonts w:ascii="Times New Roman" w:hAnsi="Times New Roman" w:cs="Times New Roman"/>
-          <w:sz w:val="28"/>
-          <w:szCs w:val="28"/>
-          <w:lang w:val="ru-RU"/>
-        </w:rPr>
-        <w:t>Дата:</w:t>
-      </w:r>
-      <w:r>
-        <w:rPr>
-          <w:rFonts w:ascii="Times New Roman" w:hAnsi="Times New Roman" w:cs="Times New Roman"/>
-          <w:sz w:val="28"/>
-          <w:szCs w:val="28"/>
-          <w:lang w:val="ru-RU"/>
-        </w:rPr>
-        <w:t xml:space="preserve"> апрель 2026 г.</w:t>
-      </w:r>
-    </w:p>
-    <w:p>
-      <w:pPr>
-        <w:rPr>
-          <w:rFonts w:ascii="Times New Roman" w:hAnsi="Times New Roman" w:cs="Times New Roman"/>
-          <w:sz w:val="28"/>
-          <w:szCs w:val="28"/>
-          <w:lang w:val="ru-RU"/>
-        </w:rPr>
-      </w:pPr>
-      <w:r>
-        <w:rPr>
-          <w:rFonts w:ascii="Times New Roman" w:hAnsi="Times New Roman" w:cs="Times New Roman"/>
-          <w:sz w:val="28"/>
-          <w:szCs w:val="28"/>
-          <w:lang w:val="ru-RU"/>
-        </w:rPr>
-        <w:t>---</w:t>
-      </w:r>
-    </w:p>
-    <w:p>
-      <w:pPr>
         <w:pStyle w:val="21"/>
+        <w:spacing w:before="0" w:line="360" w:lineRule="auto"/>
+        <w:jc w:val="center"/>
         <w:rPr>
           <w:rFonts w:ascii="Times New Roman" w:hAnsi="Times New Roman" w:cs="Times New Roman"/>
           <w:color w:val="auto"/>
@@ -117,15 +64,14 @@
     <w:p>
       <w:pPr>
         <w:rPr>
-          <w:rFonts w:ascii="Times New Roman" w:hAnsi="Times New Roman" w:cs="Times New Roman"/>
-          <w:sz w:val="28"/>
-          <w:szCs w:val="28"/>
           <w:lang w:val="ru-RU"/>
         </w:rPr>
       </w:pPr>
     </w:p>
     <w:p>
       <w:pPr>
+        <w:spacing w:after="0" w:line="360" w:lineRule="auto"/>
+        <w:ind w:firstLine="720"/>
         <w:rPr>
           <w:rFonts w:ascii="Times New Roman" w:hAnsi="Times New Roman" w:cs="Times New Roman"/>
           <w:sz w:val="28"/>
@@ -149,20 +95,13 @@
           <w:szCs w:val="28"/>
           <w:lang w:val="ru-RU"/>
         </w:rPr>
-        <w:t>Информация о разработчике</w:t>
-      </w:r>
-      <w:r>
-        <w:rPr>
-          <w:rFonts w:ascii="Times New Roman" w:hAnsi="Times New Roman" w:cs="Times New Roman"/>
-          <w:sz w:val="28"/>
-          <w:szCs w:val="28"/>
-          <w:lang w:val="ru-RU"/>
-        </w:rPr>
-        <w:t xml:space="preserve"> </w:t>
+        <w:t xml:space="preserve">Информация о разработчике </w:t>
       </w:r>
     </w:p>
     <w:p>
       <w:pPr>
+        <w:spacing w:after="0" w:line="360" w:lineRule="auto"/>
+        <w:ind w:firstLine="720"/>
         <w:rPr>
           <w:rFonts w:ascii="Times New Roman" w:hAnsi="Times New Roman" w:cs="Times New Roman"/>
           <w:sz w:val="28"/>
@@ -186,20 +125,13 @@
           <w:szCs w:val="28"/>
           <w:lang w:val="ru-RU"/>
         </w:rPr>
-        <w:t>Информация о сервере базы данных</w:t>
-      </w:r>
-      <w:r>
-        <w:rPr>
-          <w:rFonts w:ascii="Times New Roman" w:hAnsi="Times New Roman" w:cs="Times New Roman"/>
-          <w:sz w:val="28"/>
-          <w:szCs w:val="28"/>
-          <w:lang w:val="ru-RU"/>
-        </w:rPr>
-        <w:t xml:space="preserve"> </w:t>
+        <w:t xml:space="preserve">Информация о сервере базы данных </w:t>
       </w:r>
     </w:p>
     <w:p>
       <w:pPr>
+        <w:spacing w:after="0" w:line="360" w:lineRule="auto"/>
+        <w:ind w:firstLine="720"/>
         <w:rPr>
           <w:rFonts w:ascii="Times New Roman" w:hAnsi="Times New Roman" w:cs="Times New Roman"/>
           <w:sz w:val="28"/>
@@ -223,20 +155,13 @@
           <w:szCs w:val="28"/>
           <w:lang w:val="ru-RU"/>
         </w:rPr>
-        <w:t>Информация о базе данных</w:t>
-      </w:r>
-      <w:r>
-        <w:rPr>
-          <w:rFonts w:ascii="Times New Roman" w:hAnsi="Times New Roman" w:cs="Times New Roman"/>
-          <w:sz w:val="28"/>
-          <w:szCs w:val="28"/>
-          <w:lang w:val="ru-RU"/>
-        </w:rPr>
-        <w:t xml:space="preserve"> </w:t>
+        <w:t xml:space="preserve">Информация о базе данных </w:t>
       </w:r>
     </w:p>
     <w:p>
       <w:pPr>
+        <w:spacing w:after="0" w:line="360" w:lineRule="auto"/>
+        <w:ind w:firstLine="720"/>
         <w:rPr>
           <w:rFonts w:ascii="Times New Roman" w:hAnsi="Times New Roman" w:cs="Times New Roman"/>
           <w:sz w:val="28"/>
@@ -260,20 +185,13 @@
           <w:szCs w:val="28"/>
           <w:lang w:val="ru-RU"/>
         </w:rPr>
-        <w:t>Информация о платформе</w:t>
-      </w:r>
-      <w:r>
-        <w:rPr>
-          <w:rFonts w:ascii="Times New Roman" w:hAnsi="Times New Roman" w:cs="Times New Roman"/>
-          <w:sz w:val="28"/>
-          <w:szCs w:val="28"/>
-          <w:lang w:val="ru-RU"/>
-        </w:rPr>
-        <w:t xml:space="preserve"> </w:t>
+        <w:t xml:space="preserve">Информация о платформе </w:t>
       </w:r>
     </w:p>
     <w:p>
       <w:pPr>
+        <w:spacing w:after="0" w:line="360" w:lineRule="auto"/>
+        <w:ind w:firstLine="720"/>
         <w:rPr>
           <w:rFonts w:ascii="Times New Roman" w:hAnsi="Times New Roman" w:cs="Times New Roman"/>
           <w:sz w:val="28"/>
@@ -297,20 +215,13 @@
           <w:szCs w:val="28"/>
           <w:lang w:val="ru-RU"/>
         </w:rPr>
-        <w:t>Информация о программе</w:t>
-      </w:r>
-      <w:r>
-        <w:rPr>
-          <w:rFonts w:ascii="Times New Roman" w:hAnsi="Times New Roman" w:cs="Times New Roman"/>
-          <w:sz w:val="28"/>
-          <w:szCs w:val="28"/>
-          <w:lang w:val="ru-RU"/>
-        </w:rPr>
-        <w:t xml:space="preserve"> </w:t>
+        <w:t xml:space="preserve">Информация о программе </w:t>
       </w:r>
     </w:p>
     <w:p>
       <w:pPr>
+        <w:spacing w:after="0" w:line="360" w:lineRule="auto"/>
+        <w:ind w:firstLine="720"/>
         <w:rPr>
           <w:rFonts w:ascii="Times New Roman" w:hAnsi="Times New Roman" w:cs="Times New Roman"/>
           <w:sz w:val="28"/>
@@ -334,16 +245,7 @@
           <w:szCs w:val="28"/>
           <w:lang w:val="ru-RU"/>
         </w:rPr>
-        <w:t>Информация о результатах тестирования</w:t>
-      </w:r>
-      <w:r>
-        <w:rPr>
-          <w:rFonts w:ascii="Times New Roman" w:hAnsi="Times New Roman" w:cs="Times New Roman"/>
-          <w:sz w:val="28"/>
-          <w:szCs w:val="28"/>
-          <w:lang w:val="ru-RU"/>
-        </w:rPr>
-        <w:t xml:space="preserve"> </w:t>
+        <w:t xml:space="preserve">Информация о результатах тестирования </w:t>
       </w:r>
     </w:p>
     <w:p>
@@ -353,33 +255,32 @@
           <w:rFonts w:ascii="Times New Roman" w:hAnsi="Times New Roman" w:cs="Times New Roman"/>
           <w:color w:val="auto"/>
           <w:sz w:val="28"/>
+          <w:lang w:val="ru-RU"/>
         </w:rPr>
       </w:pPr>
     </w:p>
     <w:p>
       <w:pPr>
-        <w:pStyle w:val="21"/>
+        <w:spacing w:after="0" w:line="360" w:lineRule="auto"/>
+        <w:ind w:firstLine="720"/>
         <w:rPr>
           <w:rFonts w:ascii="Times New Roman" w:hAnsi="Times New Roman" w:cs="Times New Roman"/>
-          <w:color w:val="auto"/>
+          <w:b/>
           <w:sz w:val="28"/>
+          <w:szCs w:val="28"/>
+          <w:lang w:val="ru-RU"/>
         </w:rPr>
       </w:pPr>
       <w:r>
         <w:rPr>
           <w:rFonts w:ascii="Times New Roman" w:hAnsi="Times New Roman" w:cs="Times New Roman"/>
-          <w:color w:val="auto"/>
+          <w:b/>
           <w:sz w:val="28"/>
+          <w:szCs w:val="28"/>
+          <w:lang w:val="ru-RU"/>
         </w:rPr>
         <w:t>1. Информация о разработчике</w:t>
       </w:r>
-    </w:p>
-    <w:p>
-      <w:pPr>
-        <w:rPr>
-          <w:rFonts w:ascii="Times New Roman" w:hAnsi="Times New Roman" w:cs="Times New Roman"/>
-        </w:rPr>
-      </w:pPr>
     </w:p>
     <w:tbl>
       <w:tblPr>
@@ -807,50 +708,33 @@
     </w:tbl>
     <w:p>
       <w:pPr>
-        <w:pStyle w:val="21"/>
         <w:rPr>
           <w:rFonts w:ascii="Times New Roman" w:hAnsi="Times New Roman" w:cs="Times New Roman"/>
-          <w:lang w:val="ru-RU"/>
         </w:rPr>
       </w:pPr>
     </w:p>
     <w:p>
       <w:pPr>
+        <w:spacing w:after="0" w:line="360" w:lineRule="auto"/>
+        <w:ind w:firstLine="720"/>
         <w:rPr>
           <w:rFonts w:ascii="Times New Roman" w:hAnsi="Times New Roman" w:cs="Times New Roman"/>
-          <w:lang w:val="ru-RU"/>
-        </w:rPr>
-      </w:pPr>
-    </w:p>
-    <w:p>
-      <w:pPr>
-        <w:pStyle w:val="21"/>
-        <w:spacing w:before="0" w:line="360" w:lineRule="auto"/>
-        <w:rPr>
-          <w:rFonts w:ascii="Times New Roman" w:hAnsi="Times New Roman" w:cs="Times New Roman"/>
-          <w:color w:val="auto"/>
+          <w:b/>
           <w:sz w:val="28"/>
+          <w:szCs w:val="28"/>
           <w:lang w:val="ru-RU"/>
         </w:rPr>
       </w:pPr>
       <w:r>
         <w:rPr>
           <w:rFonts w:ascii="Times New Roman" w:hAnsi="Times New Roman" w:cs="Times New Roman"/>
-          <w:color w:val="auto"/>
+          <w:b/>
           <w:sz w:val="28"/>
+          <w:szCs w:val="28"/>
           <w:lang w:val="ru-RU"/>
         </w:rPr>
-        <w:lastRenderedPageBreak/>
         <w:t>2. Информация о сервере базы данных</w:t>
       </w:r>
-    </w:p>
-    <w:p>
-      <w:pPr>
-        <w:rPr>
-          <w:rFonts w:ascii="Times New Roman" w:hAnsi="Times New Roman" w:cs="Times New Roman"/>
-          <w:lang w:val="ru-RU"/>
-        </w:rPr>
-      </w:pPr>
     </w:p>
     <w:tbl>
       <w:tblPr>
@@ -892,7 +776,7 @@
         </w:tc>
         <w:tc>
           <w:tcPr>
-            <w:tcW w:w="4320" w:type="dxa"/>
+            <w:tcW w:w="4363" w:type="dxa"/>
             <w:tcBorders>
               <w:top w:val="single" w:sz="4" w:space="0" w:color="auto"/>
               <w:left w:val="single" w:sz="4" w:space="0" w:color="auto"/>
@@ -912,14 +796,7 @@
                 <w:rFonts w:ascii="Times New Roman" w:hAnsi="Times New Roman" w:cs="Times New Roman"/>
                 <w:sz w:val="24"/>
               </w:rPr>
-              <w:t>Значен</w:t>
-            </w:r>
-            <w:r>
-              <w:rPr>
-                <w:rFonts w:ascii="Times New Roman" w:hAnsi="Times New Roman" w:cs="Times New Roman"/>
-                <w:sz w:val="24"/>
-              </w:rPr>
-              <w:t>ие</w:t>
+              <w:t>Значение</w:t>
             </w:r>
           </w:p>
         </w:tc>
@@ -953,7 +830,7 @@
         </w:tc>
         <w:tc>
           <w:tcPr>
-            <w:tcW w:w="4320" w:type="dxa"/>
+            <w:tcW w:w="4363" w:type="dxa"/>
             <w:tcBorders>
               <w:top w:val="single" w:sz="4" w:space="0" w:color="auto"/>
               <w:left w:val="single" w:sz="4" w:space="0" w:color="auto"/>
@@ -1007,7 +884,7 @@
         </w:tc>
         <w:tc>
           <w:tcPr>
-            <w:tcW w:w="4320" w:type="dxa"/>
+            <w:tcW w:w="4363" w:type="dxa"/>
             <w:tcBorders>
               <w:top w:val="single" w:sz="4" w:space="0" w:color="auto"/>
               <w:left w:val="single" w:sz="4" w:space="0" w:color="auto"/>
@@ -1077,7 +954,7 @@
         </w:tc>
         <w:tc>
           <w:tcPr>
-            <w:tcW w:w="4320" w:type="dxa"/>
+            <w:tcW w:w="4363" w:type="dxa"/>
             <w:tcBorders>
               <w:top w:val="single" w:sz="4" w:space="0" w:color="auto"/>
               <w:left w:val="single" w:sz="4" w:space="0" w:color="auto"/>
@@ -1183,16 +1060,23 @@
     </w:tbl>
     <w:p>
       <w:pPr>
+        <w:spacing w:after="0" w:line="360" w:lineRule="auto"/>
+        <w:ind w:firstLine="720"/>
         <w:rPr>
           <w:rFonts w:ascii="Times New Roman" w:hAnsi="Times New Roman" w:cs="Times New Roman"/>
           <w:sz w:val="28"/>
+          <w:szCs w:val="28"/>
+          <w:lang w:val="ru-RU"/>
         </w:rPr>
       </w:pPr>
       <w:r>
         <w:rPr>
           <w:rFonts w:ascii="Times New Roman" w:hAnsi="Times New Roman" w:cs="Times New Roman"/>
           <w:sz w:val="28"/>
+          <w:szCs w:val="28"/>
+          <w:lang w:val="ru-RU"/>
         </w:rPr>
+        <w:lastRenderedPageBreak/>
         <w:t>Host=localhost</w:t>
       </w:r>
       <w:proofErr w:type="gramStart"/>
@@ -1200,6 +1084,8 @@
         <w:rPr>
           <w:rFonts w:ascii="Times New Roman" w:hAnsi="Times New Roman" w:cs="Times New Roman"/>
           <w:sz w:val="28"/>
+          <w:szCs w:val="28"/>
+          <w:lang w:val="ru-RU"/>
         </w:rPr>
         <w:t>;Port</w:t>
       </w:r>
@@ -1208,6 +1094,8 @@
         <w:rPr>
           <w:rFonts w:ascii="Times New Roman" w:hAnsi="Times New Roman" w:cs="Times New Roman"/>
           <w:sz w:val="28"/>
+          <w:szCs w:val="28"/>
+          <w:lang w:val="ru-RU"/>
         </w:rPr>
         <w:t>=5432;Database=matie_workshop;Username=postgres;Password</w:t>
       </w:r>
@@ -1215,6 +1103,8 @@
         <w:rPr>
           <w:rFonts w:ascii="Times New Roman" w:hAnsi="Times New Roman" w:cs="Times New Roman"/>
           <w:sz w:val="28"/>
+          <w:szCs w:val="28"/>
+          <w:lang w:val="ru-RU"/>
         </w:rPr>
         <w:t>=1234</w:t>
       </w:r>
@@ -1413,12 +1303,21 @@
                 <w:sz w:val="24"/>
               </w:rPr>
             </w:pPr>
-            <w:r>
-              <w:rPr>
-                <w:rFonts w:ascii="Times New Roman" w:hAnsi="Times New Roman" w:cs="Times New Roman"/>
-                <w:sz w:val="24"/>
-              </w:rPr>
-              <w:t xml:space="preserve">Порт </w:t>
+            <w:proofErr w:type="spellStart"/>
+            <w:r>
+              <w:rPr>
+                <w:rFonts w:ascii="Times New Roman" w:hAnsi="Times New Roman" w:cs="Times New Roman"/>
+                <w:sz w:val="24"/>
+              </w:rPr>
+              <w:t>Порт</w:t>
+            </w:r>
+            <w:proofErr w:type="spellEnd"/>
+            <w:r>
+              <w:rPr>
+                <w:rFonts w:ascii="Times New Roman" w:hAnsi="Times New Roman" w:cs="Times New Roman"/>
+                <w:sz w:val="24"/>
+              </w:rPr>
+              <w:t xml:space="preserve"> </w:t>
             </w:r>
             <w:proofErr w:type="spellStart"/>
             <w:r>
@@ -1602,11 +1501,11 @@
     </w:p>
     <w:p>
       <w:pPr>
-        <w:pStyle w:val="21"/>
-        <w:spacing w:before="0" w:line="360" w:lineRule="auto"/>
+        <w:spacing w:after="0" w:line="360" w:lineRule="auto"/>
+        <w:ind w:firstLine="720"/>
         <w:rPr>
           <w:rFonts w:ascii="Times New Roman" w:hAnsi="Times New Roman" w:cs="Times New Roman"/>
-          <w:color w:val="auto"/>
+          <w:b/>
           <w:sz w:val="28"/>
           <w:lang w:val="ru-RU"/>
         </w:rPr>
@@ -1614,7 +1513,7 @@
       <w:r>
         <w:rPr>
           <w:rFonts w:ascii="Times New Roman" w:hAnsi="Times New Roman" w:cs="Times New Roman"/>
-          <w:color w:val="auto"/>
+          <w:b/>
           <w:sz w:val="28"/>
           <w:lang w:val="ru-RU"/>
         </w:rPr>
@@ -1623,11 +1522,11 @@
     </w:p>
     <w:p>
       <w:pPr>
-        <w:pStyle w:val="21"/>
-        <w:spacing w:before="0" w:line="360" w:lineRule="auto"/>
+        <w:spacing w:after="0" w:line="360" w:lineRule="auto"/>
+        <w:ind w:firstLine="720"/>
         <w:rPr>
           <w:rFonts w:ascii="Times New Roman" w:hAnsi="Times New Roman" w:cs="Times New Roman"/>
-          <w:color w:val="auto"/>
+          <w:b/>
           <w:sz w:val="28"/>
           <w:lang w:val="ru-RU"/>
         </w:rPr>
@@ -1635,7 +1534,7 @@
       <w:r>
         <w:rPr>
           <w:rFonts w:ascii="Times New Roman" w:hAnsi="Times New Roman" w:cs="Times New Roman"/>
-          <w:color w:val="auto"/>
+          <w:b/>
           <w:sz w:val="28"/>
           <w:lang w:val="ru-RU"/>
         </w:rPr>
@@ -2153,11 +2052,11 @@
     </w:p>
     <w:p>
       <w:pPr>
-        <w:pStyle w:val="21"/>
-        <w:spacing w:before="0" w:line="360" w:lineRule="auto"/>
+        <w:spacing w:after="0" w:line="360" w:lineRule="auto"/>
+        <w:ind w:firstLine="720"/>
         <w:rPr>
           <w:rFonts w:ascii="Times New Roman" w:hAnsi="Times New Roman" w:cs="Times New Roman"/>
-          <w:color w:val="auto"/>
+          <w:b/>
           <w:sz w:val="28"/>
           <w:lang w:val="ru-RU"/>
         </w:rPr>
@@ -2165,11 +2064,10 @@
       <w:r>
         <w:rPr>
           <w:rFonts w:ascii="Times New Roman" w:hAnsi="Times New Roman" w:cs="Times New Roman"/>
-          <w:color w:val="auto"/>
+          <w:b/>
           <w:sz w:val="28"/>
           <w:lang w:val="ru-RU"/>
         </w:rPr>
-        <w:lastRenderedPageBreak/>
         <w:t>3.2 Основные таблицы (логическая модель)</w:t>
       </w:r>
     </w:p>
@@ -2301,14 +2199,7 @@
                 <w:rFonts w:ascii="Times New Roman" w:hAnsi="Times New Roman" w:cs="Times New Roman"/>
                 <w:sz w:val="24"/>
               </w:rPr>
-              <w:t xml:space="preserve">Роли: Client, Master, Moderator, </w:t>
-            </w:r>
-            <w:r>
-              <w:rPr>
-                <w:rFonts w:ascii="Times New Roman" w:hAnsi="Times New Roman" w:cs="Times New Roman"/>
-                <w:sz w:val="24"/>
-              </w:rPr>
-              <w:t>Administrator</w:t>
+              <w:t>Роли: Client, Master, Moderator, Administrator</w:t>
             </w:r>
           </w:p>
         </w:tc>
@@ -2500,7 +2391,16 @@
                 <w:sz w:val="24"/>
                 <w:lang w:val="ru-RU"/>
               </w:rPr>
-              <w:t>Направления коллекций (аниме, тематики и т.д.)</w:t>
+              <w:t xml:space="preserve">Направления коллекций (аниме, </w:t>
+            </w:r>
+            <w:r>
+              <w:rPr>
+                <w:rFonts w:ascii="Times New Roman" w:hAnsi="Times New Roman" w:cs="Times New Roman"/>
+                <w:sz w:val="24"/>
+                <w:lang w:val="ru-RU"/>
+              </w:rPr>
+              <w:lastRenderedPageBreak/>
+              <w:t>тематики и т.д.)</w:t>
             </w:r>
           </w:p>
         </w:tc>
@@ -2528,6 +2428,7 @@
                 <w:rFonts w:ascii="Times New Roman" w:hAnsi="Times New Roman" w:cs="Times New Roman"/>
                 <w:sz w:val="24"/>
               </w:rPr>
+              <w:lastRenderedPageBreak/>
               <w:t>«</w:t>
             </w:r>
             <w:proofErr w:type="spellStart"/>
@@ -2678,14 +2579,7 @@
                 <w:rFonts w:ascii="Times New Roman" w:hAnsi="Times New Roman" w:cs="Times New Roman"/>
                 <w:sz w:val="24"/>
               </w:rPr>
-              <w:t>Уровни к</w:t>
-            </w:r>
-            <w:r>
-              <w:rPr>
-                <w:rFonts w:ascii="Times New Roman" w:hAnsi="Times New Roman" w:cs="Times New Roman"/>
-                <w:sz w:val="24"/>
-              </w:rPr>
-              <w:t>валификации мастера</w:t>
+              <w:t>Уровни квалификации мастера</w:t>
             </w:r>
           </w:p>
         </w:tc>
@@ -2971,15 +2865,7 @@
                 <w:sz w:val="24"/>
                 <w:lang w:val="ru-RU"/>
               </w:rPr>
-              <w:t xml:space="preserve">Записи </w:t>
-            </w:r>
-            <w:r>
-              <w:rPr>
-                <w:rFonts w:ascii="Times New Roman" w:hAnsi="Times New Roman" w:cs="Times New Roman"/>
-                <w:sz w:val="24"/>
-                <w:lang w:val="ru-RU"/>
-              </w:rPr>
-              <w:t>клиентов: очередь, статус, даты</w:t>
+              <w:t>Записи клиентов: очередь, статус, даты</w:t>
             </w:r>
           </w:p>
         </w:tc>
@@ -3209,20 +3095,22 @@
     </w:p>
     <w:p>
       <w:pPr>
-        <w:pStyle w:val="21"/>
-        <w:spacing w:before="0" w:line="360" w:lineRule="auto"/>
+        <w:spacing w:after="0" w:line="360" w:lineRule="auto"/>
+        <w:ind w:firstLine="720"/>
         <w:rPr>
           <w:rFonts w:ascii="Times New Roman" w:hAnsi="Times New Roman" w:cs="Times New Roman"/>
-          <w:color w:val="auto"/>
+          <w:b/>
           <w:sz w:val="28"/>
+          <w:szCs w:val="28"/>
           <w:lang w:val="ru-RU"/>
         </w:rPr>
       </w:pPr>
       <w:r>
         <w:rPr>
           <w:rFonts w:ascii="Times New Roman" w:hAnsi="Times New Roman" w:cs="Times New Roman"/>
-          <w:color w:val="auto"/>
+          <w:b/>
           <w:sz w:val="28"/>
+          <w:szCs w:val="28"/>
           <w:lang w:val="ru-RU"/>
         </w:rPr>
         <w:t>3.3 Инициализация данных</w:t>
@@ -3230,6 +3118,8 @@
     </w:p>
     <w:p>
       <w:pPr>
+        <w:spacing w:after="0" w:line="360" w:lineRule="auto"/>
+        <w:ind w:firstLine="720"/>
         <w:rPr>
           <w:rFonts w:ascii="Times New Roman" w:hAnsi="Times New Roman" w:cs="Times New Roman"/>
           <w:sz w:val="28"/>
@@ -3386,23 +3276,24 @@
     </w:p>
     <w:p>
       <w:pPr>
-        <w:pStyle w:val="21"/>
-        <w:spacing w:before="0" w:line="360" w:lineRule="auto"/>
+        <w:spacing w:after="0" w:line="360" w:lineRule="auto"/>
+        <w:ind w:firstLine="720"/>
         <w:rPr>
           <w:rFonts w:ascii="Times New Roman" w:hAnsi="Times New Roman" w:cs="Times New Roman"/>
-          <w:color w:val="auto"/>
+          <w:b/>
           <w:sz w:val="28"/>
+          <w:szCs w:val="28"/>
           <w:lang w:val="ru-RU"/>
         </w:rPr>
       </w:pPr>
       <w:r>
         <w:rPr>
           <w:rFonts w:ascii="Times New Roman" w:hAnsi="Times New Roman" w:cs="Times New Roman"/>
-          <w:color w:val="auto"/>
+          <w:b/>
           <w:sz w:val="28"/>
+          <w:szCs w:val="28"/>
           <w:lang w:val="ru-RU"/>
         </w:rPr>
-        <w:lastRenderedPageBreak/>
         <w:t>4. Информация о платформе, для которой разработано приложение</w:t>
       </w:r>
     </w:p>
@@ -3435,7 +3326,6 @@
                 <w:lang w:val="ru-RU"/>
               </w:rPr>
             </w:pPr>
-            <w:proofErr w:type="spellStart"/>
             <w:r>
               <w:rPr>
                 <w:rFonts w:ascii="Times New Roman" w:hAnsi="Times New Roman" w:cs="Times New Roman"/>
@@ -3444,7 +3334,6 @@
               </w:rPr>
               <w:t>Параметр</w:t>
             </w:r>
-            <w:proofErr w:type="spellEnd"/>
           </w:p>
         </w:tc>
         <w:tc>
@@ -3496,23 +3385,13 @@
                 <w:lang w:val="ru-RU"/>
               </w:rPr>
             </w:pPr>
-            <w:proofErr w:type="spellStart"/>
             <w:r>
               <w:rPr>
                 <w:rFonts w:ascii="Times New Roman" w:hAnsi="Times New Roman" w:cs="Times New Roman"/>
                 <w:sz w:val="24"/>
                 <w:lang w:val="ru-RU"/>
               </w:rPr>
-              <w:t>Целевая</w:t>
-            </w:r>
-            <w:proofErr w:type="spellEnd"/>
-            <w:r>
-              <w:rPr>
-                <w:rFonts w:ascii="Times New Roman" w:hAnsi="Times New Roman" w:cs="Times New Roman"/>
-                <w:sz w:val="24"/>
-                <w:lang w:val="ru-RU"/>
-              </w:rPr>
-              <w:t xml:space="preserve"> ОС</w:t>
+              <w:t>Целевая ОС</w:t>
             </w:r>
           </w:p>
         </w:tc>
@@ -3542,21 +3421,23 @@
               </w:rPr>
               <w:t xml:space="preserve"> </w:t>
             </w:r>
+            <w:proofErr w:type="spellStart"/>
             <w:r>
               <w:rPr>
                 <w:rFonts w:ascii="Times New Roman" w:hAnsi="Times New Roman" w:cs="Times New Roman"/>
                 <w:sz w:val="24"/>
                 <w:lang w:val="ru-RU"/>
               </w:rPr>
-              <w:t xml:space="preserve">Microsoft Windows </w:t>
-            </w:r>
+              <w:t>Microsoft</w:t>
+            </w:r>
+            <w:proofErr w:type="spellEnd"/>
             <w:r>
               <w:rPr>
                 <w:rFonts w:ascii="Times New Roman" w:hAnsi="Times New Roman" w:cs="Times New Roman"/>
                 <w:sz w:val="24"/>
                 <w:lang w:val="ru-RU"/>
               </w:rPr>
-              <w:t xml:space="preserve"> (</w:t>
+              <w:t xml:space="preserve"> </w:t>
             </w:r>
             <w:proofErr w:type="spellStart"/>
             <w:r>
@@ -3565,7 +3446,7 @@
                 <w:sz w:val="24"/>
                 <w:lang w:val="ru-RU"/>
               </w:rPr>
-              <w:t>настольное</w:t>
+              <w:t>Windows</w:t>
             </w:r>
             <w:proofErr w:type="spellEnd"/>
             <w:r>
@@ -3574,25 +3455,7 @@
                 <w:sz w:val="24"/>
                 <w:lang w:val="ru-RU"/>
               </w:rPr>
-              <w:t xml:space="preserve"> </w:t>
-            </w:r>
-            <w:proofErr w:type="spellStart"/>
-            <w:r>
-              <w:rPr>
-                <w:rFonts w:ascii="Times New Roman" w:hAnsi="Times New Roman" w:cs="Times New Roman"/>
-                <w:sz w:val="24"/>
-                <w:lang w:val="ru-RU"/>
-              </w:rPr>
-              <w:t>окно</w:t>
-            </w:r>
-            <w:proofErr w:type="spellEnd"/>
-            <w:r>
-              <w:rPr>
-                <w:rFonts w:ascii="Times New Roman" w:hAnsi="Times New Roman" w:cs="Times New Roman"/>
-                <w:sz w:val="24"/>
-                <w:lang w:val="ru-RU"/>
-              </w:rPr>
-              <w:t>)</w:t>
+              <w:t xml:space="preserve">  (настольное окно)</w:t>
             </w:r>
           </w:p>
         </w:tc>
@@ -3650,49 +3513,25 @@
                 <w:sz w:val="24"/>
                 <w:lang w:val="ru-RU"/>
               </w:rPr>
-              <w:t xml:space="preserve"> </w:t>
-            </w:r>
+              <w:t xml:space="preserve"> .NET 8  («</w:t>
+            </w:r>
+            <w:proofErr w:type="spellStart"/>
             <w:r>
               <w:rPr>
                 <w:rFonts w:ascii="Times New Roman" w:hAnsi="Times New Roman" w:cs="Times New Roman"/>
                 <w:sz w:val="24"/>
                 <w:lang w:val="ru-RU"/>
               </w:rPr>
-              <w:t xml:space="preserve">.NET 8 </w:t>
-            </w:r>
+              <w:t>TargetFramework</w:t>
+            </w:r>
+            <w:proofErr w:type="spellEnd"/>
             <w:r>
               <w:rPr>
                 <w:rFonts w:ascii="Times New Roman" w:hAnsi="Times New Roman" w:cs="Times New Roman"/>
                 <w:sz w:val="24"/>
                 <w:lang w:val="ru-RU"/>
               </w:rPr>
-              <w:t xml:space="preserve"> («</w:t>
-            </w:r>
-            <w:proofErr w:type="spellStart"/>
-            <w:r>
-              <w:rPr>
-                <w:rFonts w:ascii="Times New Roman" w:hAnsi="Times New Roman" w:cs="Times New Roman"/>
-                <w:sz w:val="24"/>
-                <w:lang w:val="ru-RU"/>
-              </w:rPr>
-              <w:t>TargetFramework</w:t>
-            </w:r>
-            <w:proofErr w:type="spellEnd"/>
-            <w:r>
-              <w:rPr>
-                <w:rFonts w:ascii="Times New Roman" w:hAnsi="Times New Roman" w:cs="Times New Roman"/>
-                <w:sz w:val="24"/>
-                <w:lang w:val="ru-RU"/>
-              </w:rPr>
-              <w:t>: net8.0»</w:t>
-            </w:r>
-            <w:r>
-              <w:rPr>
-                <w:rFonts w:ascii="Times New Roman" w:hAnsi="Times New Roman" w:cs="Times New Roman"/>
-                <w:sz w:val="24"/>
-                <w:lang w:val="ru-RU"/>
-              </w:rPr>
-              <w:t>)</w:t>
+              <w:t>: net8.0»)</w:t>
             </w:r>
           </w:p>
         </w:tc>
@@ -3722,6 +3561,7 @@
                 <w:sz w:val="24"/>
                 <w:lang w:val="ru-RU"/>
               </w:rPr>
+              <w:lastRenderedPageBreak/>
               <w:t>UI-фреймворк</w:t>
             </w:r>
           </w:p>
@@ -3750,23 +3590,7 @@
                 <w:sz w:val="24"/>
                 <w:lang w:val="ru-RU"/>
               </w:rPr>
-              <w:t xml:space="preserve"> </w:t>
-            </w:r>
-            <w:r>
-              <w:rPr>
-                <w:rFonts w:ascii="Times New Roman" w:hAnsi="Times New Roman" w:cs="Times New Roman"/>
-                <w:sz w:val="24"/>
-                <w:lang w:val="ru-RU"/>
-              </w:rPr>
-              <w:t xml:space="preserve">Avalonia UI 12 </w:t>
-            </w:r>
-            <w:r>
-              <w:rPr>
-                <w:rFonts w:ascii="Times New Roman" w:hAnsi="Times New Roman" w:cs="Times New Roman"/>
-                <w:sz w:val="24"/>
-                <w:lang w:val="ru-RU"/>
-              </w:rPr>
-              <w:t xml:space="preserve"> (кроссплатформенный XAML-подобный UI; сборка ориентирована на Desktop)</w:t>
+              <w:t xml:space="preserve"> Avalonia UI 12  (кроссплатформенный XAML-подобный UI; сборка ориентирована на Desktop)</w:t>
             </w:r>
           </w:p>
         </w:tc>
@@ -3790,34 +3614,14 @@
                 <w:lang w:val="ru-RU"/>
               </w:rPr>
             </w:pPr>
-            <w:proofErr w:type="spellStart"/>
             <w:r>
               <w:rPr>
                 <w:rFonts w:ascii="Times New Roman" w:hAnsi="Times New Roman" w:cs="Times New Roman"/>
                 <w:sz w:val="24"/>
                 <w:lang w:val="ru-RU"/>
               </w:rPr>
-              <w:t>Тип</w:t>
-            </w:r>
-            <w:proofErr w:type="spellEnd"/>
-            <w:r>
-              <w:rPr>
-                <w:rFonts w:ascii="Times New Roman" w:hAnsi="Times New Roman" w:cs="Times New Roman"/>
-                <w:sz w:val="24"/>
-                <w:lang w:val="ru-RU"/>
-              </w:rPr>
-              <w:t xml:space="preserve"> </w:t>
-            </w:r>
-            <w:proofErr w:type="spellStart"/>
-            <w:r>
-              <w:rPr>
-                <w:rFonts w:ascii="Times New Roman" w:hAnsi="Times New Roman" w:cs="Times New Roman"/>
-                <w:sz w:val="24"/>
-                <w:lang w:val="ru-RU"/>
-              </w:rPr>
-              <w:t>приложения</w:t>
-            </w:r>
-            <w:proofErr w:type="spellEnd"/>
+              <w:t>Тип приложения</w:t>
+            </w:r>
           </w:p>
         </w:tc>
         <w:tc>
@@ -3844,15 +3648,25 @@
                 <w:sz w:val="24"/>
                 <w:lang w:val="ru-RU"/>
               </w:rPr>
-              <w:t xml:space="preserve">Один </w:t>
-            </w:r>
+              <w:t>Один исполняемый процесс («</w:t>
+            </w:r>
+            <w:proofErr w:type="spellStart"/>
             <w:r>
               <w:rPr>
                 <w:rFonts w:ascii="Times New Roman" w:hAnsi="Times New Roman" w:cs="Times New Roman"/>
                 <w:sz w:val="24"/>
                 <w:lang w:val="ru-RU"/>
               </w:rPr>
-              <w:t>исполняемый процесс («</w:t>
+              <w:t>OutputType</w:t>
+            </w:r>
+            <w:proofErr w:type="spellEnd"/>
+            <w:r>
+              <w:rPr>
+                <w:rFonts w:ascii="Times New Roman" w:hAnsi="Times New Roman" w:cs="Times New Roman"/>
+                <w:sz w:val="24"/>
+                <w:lang w:val="ru-RU"/>
+              </w:rPr>
+              <w:t xml:space="preserve">: </w:t>
             </w:r>
             <w:proofErr w:type="spellStart"/>
             <w:r>
@@ -3861,7 +3675,7 @@
                 <w:sz w:val="24"/>
                 <w:lang w:val="ru-RU"/>
               </w:rPr>
-              <w:t>OutputType</w:t>
+              <w:t>WinExe</w:t>
             </w:r>
             <w:proofErr w:type="spellEnd"/>
             <w:r>
@@ -3870,33 +3684,7 @@
                 <w:sz w:val="24"/>
                 <w:lang w:val="ru-RU"/>
               </w:rPr>
-              <w:t xml:space="preserve">: </w:t>
-            </w:r>
-            <w:proofErr w:type="spellStart"/>
-            <w:r>
-              <w:rPr>
-                <w:rFonts w:ascii="Times New Roman" w:hAnsi="Times New Roman" w:cs="Times New Roman"/>
-                <w:sz w:val="24"/>
-                <w:lang w:val="ru-RU"/>
-              </w:rPr>
-              <w:t>WinExe</w:t>
-            </w:r>
-            <w:proofErr w:type="spellEnd"/>
-            <w:r>
-              <w:rPr>
-                <w:rFonts w:ascii="Times New Roman" w:hAnsi="Times New Roman" w:cs="Times New Roman"/>
-                <w:sz w:val="24"/>
-                <w:lang w:val="ru-RU"/>
-              </w:rPr>
-              <w:t>»</w:t>
-            </w:r>
-            <w:r>
-              <w:rPr>
-                <w:rFonts w:ascii="Times New Roman" w:hAnsi="Times New Roman" w:cs="Times New Roman"/>
-                <w:sz w:val="24"/>
-                <w:lang w:val="ru-RU"/>
-              </w:rPr>
-              <w:t xml:space="preserve">), классическое окно с </w:t>
+              <w:t xml:space="preserve">»), классическое окно с </w:t>
             </w:r>
             <w:proofErr w:type="spellStart"/>
             <w:r>
@@ -3938,7 +3726,6 @@
                 <w:lang w:val="ru-RU"/>
               </w:rPr>
             </w:pPr>
-            <w:proofErr w:type="spellStart"/>
             <w:r>
               <w:rPr>
                 <w:rFonts w:ascii="Times New Roman" w:hAnsi="Times New Roman" w:cs="Times New Roman"/>
@@ -3947,7 +3734,6 @@
               </w:rPr>
               <w:t>Конфигурация</w:t>
             </w:r>
-            <w:proofErr w:type="spellEnd"/>
           </w:p>
         </w:tc>
         <w:tc>
@@ -3965,14 +3751,12 @@
               <w:rPr>
                 <w:rFonts w:ascii="Times New Roman" w:hAnsi="Times New Roman" w:cs="Times New Roman"/>
                 <w:sz w:val="24"/>
-                <w:lang w:val="ru-RU"/>
               </w:rPr>
             </w:pPr>
             <w:r>
               <w:rPr>
                 <w:rFonts w:ascii="Times New Roman" w:hAnsi="Times New Roman" w:cs="Times New Roman"/>
                 <w:sz w:val="24"/>
-                <w:lang w:val="ru-RU"/>
               </w:rPr>
               <w:t>JSON («</w:t>
             </w:r>
@@ -3981,7 +3765,6 @@
               <w:rPr>
                 <w:rFonts w:ascii="Times New Roman" w:hAnsi="Times New Roman" w:cs="Times New Roman"/>
                 <w:sz w:val="24"/>
-                <w:lang w:val="ru-RU"/>
               </w:rPr>
               <w:t>Microsoft.Extensions.Configuration.Json</w:t>
             </w:r>
@@ -3990,17 +3773,8 @@
               <w:rPr>
                 <w:rFonts w:ascii="Times New Roman" w:hAnsi="Times New Roman" w:cs="Times New Roman"/>
                 <w:sz w:val="24"/>
-                <w:lang w:val="ru-RU"/>
-              </w:rPr>
-              <w:t>»</w:t>
-            </w:r>
-            <w:r>
-              <w:rPr>
-                <w:rFonts w:ascii="Times New Roman" w:hAnsi="Times New Roman" w:cs="Times New Roman"/>
-                <w:sz w:val="24"/>
-                <w:lang w:val="ru-RU"/>
-              </w:rPr>
-              <w:t>)</w:t>
+              </w:rPr>
+              <w:t>»)</w:t>
             </w:r>
           </w:p>
         </w:tc>
@@ -4058,7 +3832,7 @@
                 <w:sz w:val="24"/>
                 <w:lang w:val="ru-RU"/>
               </w:rPr>
-              <w:t xml:space="preserve">Шрифт Inter, тема Fluent; </w:t>
+              <w:t xml:space="preserve">Шрифт </w:t>
             </w:r>
             <w:proofErr w:type="spellStart"/>
             <w:r>
@@ -4067,7 +3841,7 @@
                 <w:sz w:val="24"/>
                 <w:lang w:val="ru-RU"/>
               </w:rPr>
-              <w:t>иконка</w:t>
+              <w:t>Inter</w:t>
             </w:r>
             <w:proofErr w:type="spellEnd"/>
             <w:r>
@@ -4076,7 +3850,7 @@
                 <w:sz w:val="24"/>
                 <w:lang w:val="ru-RU"/>
               </w:rPr>
-              <w:t xml:space="preserve"> </w:t>
+              <w:t xml:space="preserve">, тема </w:t>
             </w:r>
             <w:proofErr w:type="spellStart"/>
             <w:r>
@@ -4085,7 +3859,7 @@
                 <w:sz w:val="24"/>
                 <w:lang w:val="ru-RU"/>
               </w:rPr>
-              <w:t>из</w:t>
+              <w:t>Fluent</w:t>
             </w:r>
             <w:proofErr w:type="spellEnd"/>
             <w:r>
@@ -4094,23 +3868,25 @@
                 <w:sz w:val="24"/>
                 <w:lang w:val="ru-RU"/>
               </w:rPr>
-              <w:t xml:space="preserve"> «</w:t>
-            </w:r>
+              <w:t>; иконка из «</w:t>
+            </w:r>
+            <w:proofErr w:type="spellStart"/>
             <w:r>
               <w:rPr>
                 <w:rFonts w:ascii="Times New Roman" w:hAnsi="Times New Roman" w:cs="Times New Roman"/>
                 <w:sz w:val="24"/>
                 <w:lang w:val="ru-RU"/>
               </w:rPr>
-              <w:t>Resources/Brand/logo.ico»</w:t>
-            </w:r>
+              <w:t>Resources</w:t>
+            </w:r>
+            <w:proofErr w:type="spellEnd"/>
             <w:r>
               <w:rPr>
                 <w:rFonts w:ascii="Times New Roman" w:hAnsi="Times New Roman" w:cs="Times New Roman"/>
                 <w:sz w:val="24"/>
                 <w:lang w:val="ru-RU"/>
               </w:rPr>
-              <w:t xml:space="preserve"> </w:t>
+              <w:t>/</w:t>
             </w:r>
             <w:proofErr w:type="spellStart"/>
             <w:r>
@@ -4119,7 +3895,7 @@
                 <w:sz w:val="24"/>
                 <w:lang w:val="ru-RU"/>
               </w:rPr>
-              <w:t>при</w:t>
+              <w:t>Brand</w:t>
             </w:r>
             <w:proofErr w:type="spellEnd"/>
             <w:r>
@@ -4128,18 +3904,8 @@
                 <w:sz w:val="24"/>
                 <w:lang w:val="ru-RU"/>
               </w:rPr>
-              <w:t xml:space="preserve"> </w:t>
-            </w:r>
-            <w:proofErr w:type="spellStart"/>
-            <w:r>
-              <w:rPr>
-                <w:rFonts w:ascii="Times New Roman" w:hAnsi="Times New Roman" w:cs="Times New Roman"/>
-                <w:sz w:val="24"/>
-                <w:lang w:val="ru-RU"/>
-              </w:rPr>
-              <w:t>наличии</w:t>
-            </w:r>
-            <w:proofErr w:type="spellEnd"/>
+              <w:t>/logo.ico» при наличии</w:t>
+            </w:r>
           </w:p>
         </w:tc>
       </w:tr>
@@ -4148,25 +3914,28 @@
       <w:pPr>
         <w:rPr>
           <w:rFonts w:ascii="Times New Roman" w:hAnsi="Times New Roman" w:cs="Times New Roman"/>
+          <w:lang w:val="ru-RU"/>
         </w:rPr>
       </w:pPr>
     </w:p>
     <w:p>
       <w:pPr>
-        <w:pStyle w:val="21"/>
-        <w:spacing w:before="0" w:line="360" w:lineRule="auto"/>
+        <w:spacing w:after="0" w:line="360" w:lineRule="auto"/>
+        <w:ind w:firstLine="720"/>
         <w:rPr>
           <w:rFonts w:ascii="Times New Roman" w:hAnsi="Times New Roman" w:cs="Times New Roman"/>
-          <w:color w:val="auto"/>
+          <w:b/>
           <w:sz w:val="28"/>
+          <w:szCs w:val="28"/>
           <w:lang w:val="ru-RU"/>
         </w:rPr>
       </w:pPr>
       <w:r>
         <w:rPr>
           <w:rFonts w:ascii="Times New Roman" w:hAnsi="Times New Roman" w:cs="Times New Roman"/>
-          <w:color w:val="auto"/>
+          <w:b/>
           <w:sz w:val="28"/>
+          <w:szCs w:val="28"/>
           <w:lang w:val="ru-RU"/>
         </w:rPr>
         <w:t>5. Информация о программе</w:t>
@@ -4174,20 +3943,22 @@
     </w:p>
     <w:p>
       <w:pPr>
-        <w:pStyle w:val="21"/>
-        <w:spacing w:before="0" w:line="360" w:lineRule="auto"/>
+        <w:spacing w:after="0" w:line="360" w:lineRule="auto"/>
+        <w:ind w:firstLine="720"/>
         <w:rPr>
           <w:rFonts w:ascii="Times New Roman" w:hAnsi="Times New Roman" w:cs="Times New Roman"/>
-          <w:color w:val="auto"/>
+          <w:b/>
           <w:sz w:val="28"/>
+          <w:szCs w:val="28"/>
           <w:lang w:val="ru-RU"/>
         </w:rPr>
       </w:pPr>
       <w:r>
         <w:rPr>
           <w:rFonts w:ascii="Times New Roman" w:hAnsi="Times New Roman" w:cs="Times New Roman"/>
-          <w:color w:val="auto"/>
+          <w:b/>
           <w:sz w:val="28"/>
+          <w:szCs w:val="28"/>
           <w:lang w:val="ru-RU"/>
         </w:rPr>
         <w:t>5.1 Назначение</w:t>
@@ -4195,35 +3966,30 @@
     </w:p>
     <w:p>
       <w:pPr>
-        <w:spacing w:line="360" w:lineRule="auto"/>
+        <w:spacing w:after="0" w:line="360" w:lineRule="auto"/>
         <w:ind w:firstLine="720"/>
         <w:rPr>
           <w:rFonts w:ascii="Times New Roman" w:hAnsi="Times New Roman" w:cs="Times New Roman"/>
-          <w:sz w:val="24"/>
+          <w:sz w:val="28"/>
+          <w:szCs w:val="28"/>
           <w:lang w:val="ru-RU"/>
         </w:rPr>
       </w:pPr>
       <w:r>
         <w:rPr>
           <w:rFonts w:ascii="Times New Roman" w:hAnsi="Times New Roman" w:cs="Times New Roman"/>
-          <w:sz w:val="24"/>
+          <w:sz w:val="28"/>
+          <w:szCs w:val="28"/>
           <w:lang w:val="ru-RU"/>
         </w:rPr>
-        <w:t xml:space="preserve">Автоматизация учёта услуг мастерской: каталог услуг с фильтрами, запись клиентов к мастерам с </w:t>
-      </w:r>
-      <w:r>
-        <w:rPr>
-          <w:rFonts w:ascii="Times New Roman" w:hAnsi="Times New Roman" w:cs="Times New Roman"/>
-          <w:sz w:val="24"/>
-          <w:lang w:val="ru-RU"/>
-        </w:rPr>
-        <w:t xml:space="preserve">оплатой с внутреннего баланса, отзывы, </w:t>
+        <w:t xml:space="preserve">Автоматизация учёта услуг мастерской: каталог услуг с фильтрами, запись клиентов к мастерам с оплатой с внутреннего баланса, отзывы, </w:t>
       </w:r>
       <w:proofErr w:type="spellStart"/>
       <w:r>
         <w:rPr>
           <w:rFonts w:ascii="Times New Roman" w:hAnsi="Times New Roman" w:cs="Times New Roman"/>
-          <w:sz w:val="24"/>
+          <w:sz w:val="28"/>
+          <w:szCs w:val="28"/>
           <w:lang w:val="ru-RU"/>
         </w:rPr>
         <w:t>модерация</w:t>
@@ -4232,7 +3998,8 @@
       <w:r>
         <w:rPr>
           <w:rFonts w:ascii="Times New Roman" w:hAnsi="Times New Roman" w:cs="Times New Roman"/>
-          <w:sz w:val="24"/>
+          <w:sz w:val="28"/>
+          <w:szCs w:val="28"/>
           <w:lang w:val="ru-RU"/>
         </w:rPr>
         <w:t xml:space="preserve"> каталога и заявок на квалификацию, администрирование пользователей.</w:t>
@@ -4240,20 +4007,22 @@
     </w:p>
     <w:p>
       <w:pPr>
-        <w:pStyle w:val="21"/>
-        <w:spacing w:before="0" w:line="360" w:lineRule="auto"/>
+        <w:spacing w:after="0" w:line="360" w:lineRule="auto"/>
+        <w:ind w:firstLine="720"/>
         <w:rPr>
           <w:rFonts w:ascii="Times New Roman" w:hAnsi="Times New Roman" w:cs="Times New Roman"/>
-          <w:color w:val="auto"/>
+          <w:b/>
           <w:sz w:val="28"/>
+          <w:szCs w:val="28"/>
           <w:lang w:val="ru-RU"/>
         </w:rPr>
       </w:pPr>
       <w:r>
         <w:rPr>
           <w:rFonts w:ascii="Times New Roman" w:hAnsi="Times New Roman" w:cs="Times New Roman"/>
-          <w:color w:val="auto"/>
+          <w:b/>
           <w:sz w:val="28"/>
+          <w:szCs w:val="28"/>
           <w:lang w:val="ru-RU"/>
         </w:rPr>
         <w:t>5.2 Роли и функции</w:t>
@@ -4419,14 +4188,7 @@
                 <w:rFonts w:ascii="Times New Roman" w:hAnsi="Times New Roman" w:cs="Times New Roman"/>
                 <w:lang w:val="ru-RU"/>
               </w:rPr>
-              <w:t>Просмотр запи</w:t>
-            </w:r>
-            <w:r>
-              <w:rPr>
-                <w:rFonts w:ascii="Times New Roman" w:hAnsi="Times New Roman" w:cs="Times New Roman"/>
-                <w:lang w:val="ru-RU"/>
-              </w:rPr>
-              <w:t>сей и отзывов, заявка на квалификацию</w:t>
+              <w:t>Просмотр записей и отзывов, заявка на квалификацию</w:t>
             </w:r>
           </w:p>
         </w:tc>
@@ -4552,28 +4314,31 @@
     </w:p>
     <w:p>
       <w:pPr>
-        <w:pStyle w:val="21"/>
-        <w:spacing w:before="0" w:line="360" w:lineRule="auto"/>
+        <w:spacing w:after="0" w:line="360" w:lineRule="auto"/>
+        <w:ind w:firstLine="720"/>
         <w:rPr>
           <w:rFonts w:ascii="Times New Roman" w:hAnsi="Times New Roman" w:cs="Times New Roman"/>
-          <w:color w:val="auto"/>
+          <w:b/>
           <w:sz w:val="28"/>
+          <w:szCs w:val="28"/>
           <w:lang w:val="ru-RU"/>
         </w:rPr>
       </w:pPr>
       <w:r>
         <w:rPr>
           <w:rFonts w:ascii="Times New Roman" w:hAnsi="Times New Roman" w:cs="Times New Roman"/>
-          <w:color w:val="auto"/>
+          <w:b/>
           <w:sz w:val="28"/>
+          <w:szCs w:val="28"/>
           <w:lang w:val="ru-RU"/>
         </w:rPr>
-        <w:lastRenderedPageBreak/>
         <w:t>5.3 Архитектура (кратко)</w:t>
       </w:r>
     </w:p>
     <w:p>
       <w:pPr>
+        <w:spacing w:after="0" w:line="360" w:lineRule="auto"/>
+        <w:ind w:firstLine="720"/>
         <w:rPr>
           <w:rFonts w:ascii="Times New Roman" w:hAnsi="Times New Roman" w:cs="Times New Roman"/>
           <w:sz w:val="24"/>
@@ -4586,23 +4351,7 @@
           <w:sz w:val="24"/>
           <w:lang w:val="ru-RU"/>
         </w:rPr>
-        <w:t xml:space="preserve">-  </w:t>
-      </w:r>
-      <w:r>
-        <w:rPr>
-          <w:rFonts w:ascii="Times New Roman" w:hAnsi="Times New Roman" w:cs="Times New Roman"/>
-          <w:sz w:val="24"/>
-          <w:lang w:val="ru-RU"/>
-        </w:rPr>
-        <w:t>Слой представления: представления</w:t>
-      </w:r>
-      <w:r>
-        <w:rPr>
-          <w:rFonts w:ascii="Times New Roman" w:hAnsi="Times New Roman" w:cs="Times New Roman"/>
-          <w:sz w:val="24"/>
-          <w:lang w:val="ru-RU"/>
-        </w:rPr>
-        <w:t xml:space="preserve"> </w:t>
+        <w:t xml:space="preserve">-  Слой представления: представления </w:t>
       </w:r>
       <w:r>
         <w:rPr>
@@ -4649,15 +4398,7 @@
           <w:sz w:val="24"/>
           <w:lang w:val="ru-RU"/>
         </w:rPr>
-        <w:t>»</w:t>
-      </w:r>
-      <w:r>
-        <w:rPr>
-          <w:rFonts w:ascii="Times New Roman" w:hAnsi="Times New Roman" w:cs="Times New Roman"/>
-          <w:sz w:val="24"/>
-          <w:lang w:val="ru-RU"/>
-        </w:rPr>
-        <w:t>), главное окно «</w:t>
+        <w:t>»), главное окно «</w:t>
       </w:r>
       <w:proofErr w:type="spellStart"/>
       <w:r>
@@ -4674,19 +4415,13 @@
           <w:sz w:val="24"/>
           <w:lang w:val="ru-RU"/>
         </w:rPr>
-        <w:t>»</w:t>
-      </w:r>
-      <w:r>
-        <w:rPr>
-          <w:rFonts w:ascii="Times New Roman" w:hAnsi="Times New Roman" w:cs="Times New Roman"/>
-          <w:sz w:val="24"/>
-          <w:lang w:val="ru-RU"/>
-        </w:rPr>
-        <w:t xml:space="preserve">.  </w:t>
+        <w:t xml:space="preserve">».  </w:t>
       </w:r>
     </w:p>
     <w:p>
       <w:pPr>
+        <w:spacing w:after="0" w:line="360" w:lineRule="auto"/>
+        <w:ind w:firstLine="720"/>
         <w:rPr>
           <w:rFonts w:ascii="Times New Roman" w:hAnsi="Times New Roman" w:cs="Times New Roman"/>
           <w:sz w:val="24"/>
@@ -4699,15 +4434,8 @@
           <w:sz w:val="24"/>
           <w:lang w:val="ru-RU"/>
         </w:rPr>
-        <w:t xml:space="preserve">-  </w:t>
-      </w:r>
-      <w:r>
-        <w:rPr>
-          <w:rFonts w:ascii="Times New Roman" w:hAnsi="Times New Roman" w:cs="Times New Roman"/>
-          <w:sz w:val="24"/>
-          <w:lang w:val="ru-RU"/>
-        </w:rPr>
-        <w:t>Слой данных: «</w:t>
+        <w:lastRenderedPageBreak/>
+        <w:t>-  Слой данных: «</w:t>
       </w:r>
       <w:proofErr w:type="spellStart"/>
       <w:r>
@@ -4724,15 +4452,7 @@
           <w:sz w:val="24"/>
           <w:lang w:val="ru-RU"/>
         </w:rPr>
-        <w:t>»</w:t>
-      </w:r>
-      <w:r>
-        <w:rPr>
-          <w:rFonts w:ascii="Times New Roman" w:hAnsi="Times New Roman" w:cs="Times New Roman"/>
-          <w:sz w:val="24"/>
-          <w:lang w:val="ru-RU"/>
-        </w:rPr>
-        <w:t>, сущности в «</w:t>
+        <w:t>», сущности в «</w:t>
       </w:r>
       <w:r>
         <w:rPr>
@@ -4762,15 +4482,7 @@
           <w:sz w:val="24"/>
           <w:lang w:val="ru-RU"/>
         </w:rPr>
-        <w:t>»</w:t>
-      </w:r>
-      <w:r>
-        <w:rPr>
-          <w:rFonts w:ascii="Times New Roman" w:hAnsi="Times New Roman" w:cs="Times New Roman"/>
-          <w:sz w:val="24"/>
-          <w:lang w:val="ru-RU"/>
-        </w:rPr>
-        <w:t>, перечисления в «</w:t>
+        <w:t>», перечисления в «</w:t>
       </w:r>
       <w:r>
         <w:rPr>
@@ -4802,19 +4514,13 @@
           <w:sz w:val="24"/>
           <w:lang w:val="ru-RU"/>
         </w:rPr>
-        <w:t>»</w:t>
-      </w:r>
-      <w:r>
-        <w:rPr>
-          <w:rFonts w:ascii="Times New Roman" w:hAnsi="Times New Roman" w:cs="Times New Roman"/>
-          <w:sz w:val="24"/>
-          <w:lang w:val="ru-RU"/>
-        </w:rPr>
-        <w:t xml:space="preserve">.  </w:t>
+        <w:t xml:space="preserve">».  </w:t>
       </w:r>
     </w:p>
     <w:p>
       <w:pPr>
+        <w:spacing w:after="0" w:line="360" w:lineRule="auto"/>
+        <w:ind w:firstLine="720"/>
         <w:rPr>
           <w:rFonts w:ascii="Times New Roman" w:hAnsi="Times New Roman" w:cs="Times New Roman"/>
           <w:sz w:val="24"/>
@@ -4841,14 +4547,7 @@
           <w:rFonts w:ascii="Times New Roman" w:hAnsi="Times New Roman" w:cs="Times New Roman"/>
           <w:sz w:val="24"/>
         </w:rPr>
-        <w:t xml:space="preserve">: </w:t>
-      </w:r>
-      <w:r>
-        <w:rPr>
-          <w:rFonts w:ascii="Times New Roman" w:hAnsi="Times New Roman" w:cs="Times New Roman"/>
-          <w:sz w:val="24"/>
-        </w:rPr>
-        <w:t xml:space="preserve"> «</w:t>
+        <w:t>:  «</w:t>
       </w:r>
       <w:proofErr w:type="spellStart"/>
       <w:r>
@@ -4864,14 +4563,7 @@
           <w:rFonts w:ascii="Times New Roman" w:hAnsi="Times New Roman" w:cs="Times New Roman"/>
           <w:sz w:val="24"/>
         </w:rPr>
-        <w:t>»</w:t>
-      </w:r>
-      <w:r>
-        <w:rPr>
-          <w:rFonts w:ascii="Times New Roman" w:hAnsi="Times New Roman" w:cs="Times New Roman"/>
-          <w:sz w:val="24"/>
-        </w:rPr>
-        <w:t>, «</w:t>
+        <w:t>», «</w:t>
       </w:r>
       <w:proofErr w:type="spellStart"/>
       <w:r>
@@ -4887,14 +4579,7 @@
           <w:rFonts w:ascii="Times New Roman" w:hAnsi="Times New Roman" w:cs="Times New Roman"/>
           <w:sz w:val="24"/>
         </w:rPr>
-        <w:t>»</w:t>
-      </w:r>
-      <w:r>
-        <w:rPr>
-          <w:rFonts w:ascii="Times New Roman" w:hAnsi="Times New Roman" w:cs="Times New Roman"/>
-          <w:sz w:val="24"/>
-        </w:rPr>
-        <w:t xml:space="preserve">, </w:t>
+        <w:t xml:space="preserve">», </w:t>
       </w:r>
       <w:proofErr w:type="spellStart"/>
       <w:r>
@@ -4902,14 +4587,7 @@
           <w:rFonts w:ascii="Times New Roman" w:hAnsi="Times New Roman" w:cs="Times New Roman"/>
           <w:sz w:val="24"/>
         </w:rPr>
-        <w:t>инициали</w:t>
-      </w:r>
-      <w:r>
-        <w:rPr>
-          <w:rFonts w:ascii="Times New Roman" w:hAnsi="Times New Roman" w:cs="Times New Roman"/>
-          <w:sz w:val="24"/>
-        </w:rPr>
-        <w:t>зация</w:t>
+        <w:t>инициализация</w:t>
       </w:r>
       <w:proofErr w:type="spellEnd"/>
       <w:r>
@@ -4933,18 +4611,13 @@
           <w:rFonts w:ascii="Times New Roman" w:hAnsi="Times New Roman" w:cs="Times New Roman"/>
           <w:sz w:val="24"/>
         </w:rPr>
-        <w:t>»</w:t>
-      </w:r>
-      <w:r>
-        <w:rPr>
-          <w:rFonts w:ascii="Times New Roman" w:hAnsi="Times New Roman" w:cs="Times New Roman"/>
-          <w:sz w:val="24"/>
-        </w:rPr>
-        <w:t xml:space="preserve">.  </w:t>
+        <w:t xml:space="preserve">».  </w:t>
       </w:r>
     </w:p>
     <w:p>
       <w:pPr>
+        <w:spacing w:after="0" w:line="360" w:lineRule="auto"/>
+        <w:ind w:firstLine="720"/>
         <w:rPr>
           <w:rFonts w:ascii="Times New Roman" w:hAnsi="Times New Roman" w:cs="Times New Roman"/>
           <w:sz w:val="24"/>
@@ -4957,15 +4630,7 @@
           <w:sz w:val="24"/>
           <w:lang w:val="ru-RU"/>
         </w:rPr>
-        <w:t xml:space="preserve">-  </w:t>
-      </w:r>
-      <w:r>
-        <w:rPr>
-          <w:rFonts w:ascii="Times New Roman" w:hAnsi="Times New Roman" w:cs="Times New Roman"/>
-          <w:sz w:val="24"/>
-          <w:lang w:val="ru-RU"/>
-        </w:rPr>
-        <w:t xml:space="preserve">Безопасность паролей: </w:t>
+        <w:t xml:space="preserve">-  Безопасность паролей: </w:t>
       </w:r>
       <w:proofErr w:type="spellStart"/>
       <w:r>
@@ -5030,33 +4695,27 @@
           <w:sz w:val="24"/>
           <w:lang w:val="ru-RU"/>
         </w:rPr>
-        <w:t>»</w:t>
-      </w:r>
-      <w:r>
-        <w:rPr>
-          <w:rFonts w:ascii="Times New Roman" w:hAnsi="Times New Roman" w:cs="Times New Roman"/>
-          <w:sz w:val="24"/>
-          <w:lang w:val="ru-RU"/>
-        </w:rPr>
-        <w:t>).</w:t>
+        <w:t>»).</w:t>
       </w:r>
     </w:p>
     <w:p>
       <w:pPr>
-        <w:pStyle w:val="21"/>
-        <w:spacing w:before="0" w:line="360" w:lineRule="auto"/>
+        <w:spacing w:after="0" w:line="360" w:lineRule="auto"/>
+        <w:ind w:firstLine="720"/>
         <w:rPr>
           <w:rFonts w:ascii="Times New Roman" w:hAnsi="Times New Roman" w:cs="Times New Roman"/>
-          <w:color w:val="auto"/>
+          <w:b/>
           <w:sz w:val="28"/>
+          <w:szCs w:val="28"/>
           <w:lang w:val="ru-RU"/>
         </w:rPr>
       </w:pPr>
       <w:r>
         <w:rPr>
           <w:rFonts w:ascii="Times New Roman" w:hAnsi="Times New Roman" w:cs="Times New Roman"/>
-          <w:color w:val="auto"/>
+          <w:b/>
           <w:sz w:val="28"/>
+          <w:szCs w:val="28"/>
           <w:lang w:val="ru-RU"/>
         </w:rPr>
         <w:t>5.4 Ключевые файлы</w:t>
@@ -5410,20 +5069,22 @@
     </w:p>
     <w:p>
       <w:pPr>
-        <w:pStyle w:val="21"/>
-        <w:spacing w:before="0" w:line="360" w:lineRule="auto"/>
+        <w:spacing w:after="0" w:line="360" w:lineRule="auto"/>
+        <w:ind w:firstLine="720"/>
         <w:rPr>
           <w:rFonts w:ascii="Times New Roman" w:hAnsi="Times New Roman" w:cs="Times New Roman"/>
-          <w:color w:val="auto"/>
+          <w:b/>
           <w:sz w:val="28"/>
+          <w:szCs w:val="28"/>
           <w:lang w:val="ru-RU"/>
         </w:rPr>
       </w:pPr>
       <w:r>
         <w:rPr>
           <w:rFonts w:ascii="Times New Roman" w:hAnsi="Times New Roman" w:cs="Times New Roman"/>
-          <w:color w:val="auto"/>
+          <w:b/>
           <w:sz w:val="28"/>
+          <w:szCs w:val="28"/>
           <w:lang w:val="ru-RU"/>
         </w:rPr>
         <w:t>6. Информация о результатах тестирования</w:t>
@@ -5431,20 +5092,22 @@
     </w:p>
     <w:p>
       <w:pPr>
-        <w:pStyle w:val="21"/>
-        <w:spacing w:before="0" w:line="360" w:lineRule="auto"/>
+        <w:spacing w:after="0" w:line="360" w:lineRule="auto"/>
+        <w:ind w:firstLine="720"/>
         <w:rPr>
           <w:rFonts w:ascii="Times New Roman" w:hAnsi="Times New Roman" w:cs="Times New Roman"/>
-          <w:color w:val="auto"/>
+          <w:b/>
           <w:sz w:val="28"/>
+          <w:szCs w:val="28"/>
           <w:lang w:val="ru-RU"/>
         </w:rPr>
       </w:pPr>
       <w:r>
         <w:rPr>
           <w:rFonts w:ascii="Times New Roman" w:hAnsi="Times New Roman" w:cs="Times New Roman"/>
-          <w:color w:val="auto"/>
+          <w:b/>
           <w:sz w:val="28"/>
+          <w:szCs w:val="28"/>
           <w:lang w:val="ru-RU"/>
         </w:rPr>
         <w:t>6.1 Автоматизированное тестирование</w:t>
@@ -5598,14 +5261,7 @@
                 <w:rFonts w:ascii="Times New Roman" w:hAnsi="Times New Roman" w:cs="Times New Roman"/>
                 <w:sz w:val="24"/>
               </w:rPr>
-              <w:t>»</w:t>
-            </w:r>
-            <w:r>
-              <w:rPr>
-                <w:rFonts w:ascii="Times New Roman" w:hAnsi="Times New Roman" w:cs="Times New Roman"/>
-                <w:sz w:val="24"/>
-              </w:rPr>
-              <w:t xml:space="preserve"> (</w:t>
+              <w:t>» (</w:t>
             </w:r>
             <w:proofErr w:type="spellStart"/>
             <w:r>
@@ -5677,124 +5333,74 @@
                 <w:sz w:val="24"/>
                 <w:lang w:val="ru-RU"/>
               </w:rPr>
-              <w:t xml:space="preserve">Логика </w:t>
-            </w:r>
-            <w:bookmarkStart w:id="0" w:name="_GoBack"/>
-            <w:bookmarkEnd w:id="0"/>
+              <w:t xml:space="preserve">Логика проставления времени последнего </w:t>
+            </w:r>
+            <w:proofErr w:type="gramStart"/>
             <w:r>
               <w:rPr>
                 <w:rFonts w:ascii="Times New Roman" w:hAnsi="Times New Roman" w:cs="Times New Roman"/>
                 <w:sz w:val="24"/>
                 <w:lang w:val="ru-RU"/>
               </w:rPr>
-              <w:t>проставления времени</w:t>
-            </w:r>
+              <w:t>изменения  (</w:t>
+            </w:r>
+            <w:proofErr w:type="gramEnd"/>
             <w:r>
               <w:rPr>
                 <w:rFonts w:ascii="Times New Roman" w:hAnsi="Times New Roman" w:cs="Times New Roman"/>
                 <w:sz w:val="24"/>
                 <w:lang w:val="ru-RU"/>
               </w:rPr>
-              <w:t xml:space="preserve"> последнего </w:t>
-            </w:r>
-            <w:proofErr w:type="gramStart"/>
+              <w:t>«</w:t>
+            </w:r>
+            <w:proofErr w:type="spellStart"/>
+            <w:r>
+              <w:rPr>
+                <w:rFonts w:ascii="Times New Roman" w:hAnsi="Times New Roman" w:cs="Times New Roman"/>
+                <w:sz w:val="24"/>
+              </w:rPr>
+              <w:t>EntityModifiedTimestamps</w:t>
+            </w:r>
+            <w:proofErr w:type="spellEnd"/>
             <w:r>
               <w:rPr>
                 <w:rFonts w:ascii="Times New Roman" w:hAnsi="Times New Roman" w:cs="Times New Roman"/>
                 <w:sz w:val="24"/>
                 <w:lang w:val="ru-RU"/>
               </w:rPr>
-              <w:t xml:space="preserve">изменения </w:t>
-            </w:r>
+              <w:t>») для сущностей «</w:t>
+            </w:r>
+            <w:proofErr w:type="spellStart"/>
+            <w:r>
+              <w:rPr>
+                <w:rFonts w:ascii="Times New Roman" w:hAnsi="Times New Roman" w:cs="Times New Roman"/>
+                <w:sz w:val="24"/>
+              </w:rPr>
+              <w:t>WorkshopService</w:t>
+            </w:r>
+            <w:proofErr w:type="spellEnd"/>
             <w:r>
               <w:rPr>
                 <w:rFonts w:ascii="Times New Roman" w:hAnsi="Times New Roman" w:cs="Times New Roman"/>
                 <w:sz w:val="24"/>
                 <w:lang w:val="ru-RU"/>
               </w:rPr>
-              <w:t xml:space="preserve"> (</w:t>
-            </w:r>
-            <w:proofErr w:type="gramEnd"/>
+              <w:t>» и «</w:t>
+            </w:r>
+            <w:r>
+              <w:rPr>
+                <w:rFonts w:ascii="Times New Roman" w:hAnsi="Times New Roman" w:cs="Times New Roman"/>
+                <w:sz w:val="24"/>
+              </w:rPr>
+              <w:t>Booking</w:t>
+            </w:r>
             <w:r>
               <w:rPr>
                 <w:rFonts w:ascii="Times New Roman" w:hAnsi="Times New Roman" w:cs="Times New Roman"/>
                 <w:sz w:val="24"/>
                 <w:lang w:val="ru-RU"/>
               </w:rPr>
-              <w:t>«</w:t>
-            </w:r>
-            <w:proofErr w:type="spellStart"/>
-            <w:r>
-              <w:rPr>
-                <w:rFonts w:ascii="Times New Roman" w:hAnsi="Times New Roman" w:cs="Times New Roman"/>
-                <w:sz w:val="24"/>
-              </w:rPr>
-              <w:t>EntityModifiedTimestamps</w:t>
-            </w:r>
-            <w:proofErr w:type="spellEnd"/>
-            <w:r>
-              <w:rPr>
-                <w:rFonts w:ascii="Times New Roman" w:hAnsi="Times New Roman" w:cs="Times New Roman"/>
-                <w:sz w:val="24"/>
-                <w:lang w:val="ru-RU"/>
-              </w:rPr>
-              <w:t>»</w:t>
-            </w:r>
-            <w:r>
-              <w:rPr>
-                <w:rFonts w:ascii="Times New Roman" w:hAnsi="Times New Roman" w:cs="Times New Roman"/>
-                <w:sz w:val="24"/>
-                <w:lang w:val="ru-RU"/>
-              </w:rPr>
-              <w:t>) для сущностей «</w:t>
-            </w:r>
-            <w:proofErr w:type="spellStart"/>
-            <w:r>
-              <w:rPr>
-                <w:rFonts w:ascii="Times New Roman" w:hAnsi="Times New Roman" w:cs="Times New Roman"/>
-                <w:sz w:val="24"/>
-              </w:rPr>
-              <w:t>WorkshopService</w:t>
-            </w:r>
-            <w:proofErr w:type="spellEnd"/>
-            <w:r>
-              <w:rPr>
-                <w:rFonts w:ascii="Times New Roman" w:hAnsi="Times New Roman" w:cs="Times New Roman"/>
-                <w:sz w:val="24"/>
-                <w:lang w:val="ru-RU"/>
-              </w:rPr>
-              <w:t>»</w:t>
-            </w:r>
-            <w:r>
-              <w:rPr>
-                <w:rFonts w:ascii="Times New Roman" w:hAnsi="Times New Roman" w:cs="Times New Roman"/>
-                <w:sz w:val="24"/>
-                <w:lang w:val="ru-RU"/>
-              </w:rPr>
-              <w:t xml:space="preserve"> и «</w:t>
-            </w:r>
-            <w:r>
-              <w:rPr>
-                <w:rFonts w:ascii="Times New Roman" w:hAnsi="Times New Roman" w:cs="Times New Roman"/>
-                <w:sz w:val="24"/>
-              </w:rPr>
-              <w:t>Booking</w:t>
-            </w:r>
-            <w:r>
-              <w:rPr>
-                <w:rFonts w:ascii="Times New Roman" w:hAnsi="Times New Roman" w:cs="Times New Roman"/>
-                <w:sz w:val="24"/>
-                <w:lang w:val="ru-RU"/>
-              </w:rPr>
-              <w:t>»</w:t>
-            </w:r>
-            <w:r>
-              <w:rPr>
-                <w:rFonts w:ascii="Times New Roman" w:hAnsi="Times New Roman" w:cs="Times New Roman"/>
-                <w:sz w:val="24"/>
-                <w:lang w:val="ru-RU"/>
-              </w:rPr>
-              <w:t xml:space="preserve"> в состоянии «</w:t>
+              <w:t>» в состоянии «</w:t>
             </w:r>
             <w:r>
               <w:rPr>
@@ -5913,14 +5519,7 @@
                 <w:rFonts w:ascii="Times New Roman" w:hAnsi="Times New Roman" w:cs="Times New Roman"/>
                 <w:sz w:val="24"/>
               </w:rPr>
-              <w:t>»</w:t>
-            </w:r>
-            <w:r>
-              <w:rPr>
-                <w:rFonts w:ascii="Times New Roman" w:hAnsi="Times New Roman" w:cs="Times New Roman"/>
-                <w:sz w:val="24"/>
-              </w:rPr>
-              <w:t xml:space="preserve"> </w:t>
+              <w:t xml:space="preserve">» </w:t>
             </w:r>
             <w:proofErr w:type="spellStart"/>
             <w:r>
@@ -5951,6 +5550,8 @@
     </w:p>
     <w:p>
       <w:pPr>
+        <w:spacing w:after="0" w:line="360" w:lineRule="auto"/>
+        <w:ind w:firstLine="720"/>
         <w:rPr>
           <w:rFonts w:ascii="Times New Roman" w:hAnsi="Times New Roman" w:cs="Times New Roman"/>
         </w:rPr>
@@ -5964,6 +5565,7 @@
       <w:r>
         <w:rPr>
           <w:rFonts w:ascii="Times New Roman" w:hAnsi="Times New Roman" w:cs="Times New Roman"/>
+          <w:sz w:val="28"/>
           <w:lang w:val="ru-RU"/>
         </w:rPr>
         <w:t>Юнит</w:t>
@@ -5971,12 +5573,14 @@
       <w:r>
         <w:rPr>
           <w:rFonts w:ascii="Times New Roman" w:hAnsi="Times New Roman" w:cs="Times New Roman"/>
+          <w:sz w:val="28"/>
         </w:rPr>
         <w:t xml:space="preserve"> </w:t>
       </w:r>
       <w:r>
         <w:rPr>
           <w:rFonts w:ascii="Times New Roman" w:hAnsi="Times New Roman" w:cs="Times New Roman"/>
+          <w:sz w:val="28"/>
           <w:lang w:val="ru-RU"/>
         </w:rPr>
         <w:t>тесты</w:t>
@@ -5984,61 +5588,15 @@
       <w:r>
         <w:rPr>
           <w:rFonts w:ascii="Times New Roman" w:hAnsi="Times New Roman" w:cs="Times New Roman"/>
+          <w:sz w:val="28"/>
         </w:rPr>
-        <w:t xml:space="preserve">: </w:t>
-      </w:r>
-      <w:r>
-        <w:rPr>
-          <w:rFonts w:ascii="Times New Roman" w:hAnsi="Times New Roman" w:cs="Times New Roman"/>
-        </w:rPr>
-        <w:t>«</w:t>
-      </w:r>
-      <w:r>
-        <w:rPr>
-          <w:rFonts w:ascii="Times New Roman" w:hAnsi="Times New Roman" w:cs="Times New Roman"/>
-        </w:rPr>
-        <w:t>UT_TS_01</w:t>
-      </w:r>
-      <w:r>
-        <w:rPr>
-          <w:rFonts w:ascii="Times New Roman" w:hAnsi="Times New Roman" w:cs="Times New Roman"/>
-        </w:rPr>
-        <w:t>»</w:t>
-      </w:r>
-      <w:r>
-        <w:rPr>
-          <w:rFonts w:ascii="Times New Roman" w:hAnsi="Times New Roman" w:cs="Times New Roman"/>
-        </w:rPr>
-        <w:t xml:space="preserve"> … </w:t>
-      </w:r>
-      <w:r>
-        <w:rPr>
-          <w:rFonts w:ascii="Times New Roman" w:hAnsi="Times New Roman" w:cs="Times New Roman"/>
-        </w:rPr>
-        <w:t>«</w:t>
-      </w:r>
-      <w:r>
-        <w:rPr>
-          <w:rFonts w:ascii="Times New Roman" w:hAnsi="Times New Roman" w:cs="Times New Roman"/>
-        </w:rPr>
-        <w:t>UT_TS_05</w:t>
-      </w:r>
-      <w:r>
-        <w:rPr>
-          <w:rFonts w:ascii="Times New Roman" w:hAnsi="Times New Roman" w:cs="Times New Roman"/>
-        </w:rPr>
-        <w:t>»</w:t>
-      </w:r>
-      <w:r>
-        <w:rPr>
-          <w:rFonts w:ascii="Times New Roman" w:hAnsi="Times New Roman" w:cs="Times New Roman"/>
-        </w:rPr>
-        <w:t xml:space="preserve"> — </w:t>
+        <w:t xml:space="preserve">: «UT_TS_01» … «UT_TS_05» — </w:t>
       </w:r>
       <w:proofErr w:type="spellStart"/>
       <w:r>
         <w:rPr>
           <w:rFonts w:ascii="Times New Roman" w:hAnsi="Times New Roman" w:cs="Times New Roman"/>
+          <w:sz w:val="28"/>
         </w:rPr>
         <w:t>см</w:t>
       </w:r>
@@ -6046,19 +5604,15 @@
       <w:r>
         <w:rPr>
           <w:rFonts w:ascii="Times New Roman" w:hAnsi="Times New Roman" w:cs="Times New Roman"/>
+          <w:sz w:val="28"/>
         </w:rPr>
-        <w:t>.</w:t>
-      </w:r>
-      <w:r>
-        <w:rPr>
-          <w:rFonts w:ascii="Times New Roman" w:hAnsi="Times New Roman" w:cs="Times New Roman"/>
-        </w:rPr>
-        <w:t xml:space="preserve"> </w:t>
+        <w:t xml:space="preserve">. </w:t>
       </w:r>
       <w:proofErr w:type="spellStart"/>
       <w:r>
         <w:rPr>
           <w:rFonts w:ascii="Times New Roman" w:hAnsi="Times New Roman" w:cs="Times New Roman"/>
+          <w:sz w:val="28"/>
         </w:rPr>
         <w:t>файл</w:t>
       </w:r>
@@ -6066,19 +5620,15 @@
       <w:r>
         <w:rPr>
           <w:rFonts w:ascii="Times New Roman" w:hAnsi="Times New Roman" w:cs="Times New Roman"/>
+          <w:sz w:val="28"/>
         </w:rPr>
-        <w:t xml:space="preserve"> </w:t>
-      </w:r>
-      <w:r>
-        <w:rPr>
-          <w:rFonts w:ascii="Times New Roman" w:hAnsi="Times New Roman" w:cs="Times New Roman"/>
-        </w:rPr>
-        <w:t>«</w:t>
+        <w:t xml:space="preserve"> «</w:t>
       </w:r>
       <w:proofErr w:type="spellStart"/>
       <w:r>
         <w:rPr>
           <w:rFonts w:ascii="Times New Roman" w:hAnsi="Times New Roman" w:cs="Times New Roman"/>
+          <w:sz w:val="28"/>
         </w:rPr>
         <w:t>KLALIK.Tests</w:t>
       </w:r>
@@ -6086,6 +5636,7 @@
       <w:r>
         <w:rPr>
           <w:rFonts w:ascii="Times New Roman" w:hAnsi="Times New Roman" w:cs="Times New Roman"/>
+          <w:sz w:val="28"/>
         </w:rPr>
         <w:t>/</w:t>
       </w:r>
@@ -6093,6 +5644,7 @@
       <w:r>
         <w:rPr>
           <w:rFonts w:ascii="Times New Roman" w:hAnsi="Times New Roman" w:cs="Times New Roman"/>
+          <w:sz w:val="28"/>
         </w:rPr>
         <w:t>EntityModifiedTimestampsTests.cs</w:t>
       </w:r>
@@ -6100,25 +5652,17 @@
       <w:r>
         <w:rPr>
           <w:rFonts w:ascii="Times New Roman" w:hAnsi="Times New Roman" w:cs="Times New Roman"/>
+          <w:sz w:val="28"/>
         </w:rPr>
-        <w:t>»</w:t>
+        <w:t>».</w:t>
       </w:r>
-      <w:r>
-        <w:rPr>
-          <w:rFonts w:ascii="Times New Roman" w:hAnsi="Times New Roman" w:cs="Times New Roman"/>
-        </w:rPr>
-        <w:t>.</w:t>
-      </w:r>
+      <w:bookmarkStart w:id="0" w:name="_GoBack"/>
+      <w:bookmarkEnd w:id="0"/>
     </w:p>
     <w:p>
       <w:pPr>
-        <w:rPr>
-          <w:rFonts w:ascii="Times New Roman" w:hAnsi="Times New Roman" w:cs="Times New Roman"/>
-        </w:rPr>
-      </w:pPr>
-    </w:p>
-    <w:p>
-      <w:pPr>
+        <w:spacing w:after="0" w:line="360" w:lineRule="auto"/>
+        <w:ind w:firstLine="720"/>
         <w:rPr>
           <w:rFonts w:ascii="Times New Roman" w:hAnsi="Times New Roman" w:cs="Times New Roman"/>
           <w:sz w:val="24"/>
@@ -6129,40 +5673,31 @@
         <w:rPr>
           <w:rFonts w:ascii="Times New Roman" w:hAnsi="Times New Roman" w:cs="Times New Roman"/>
           <w:sz w:val="24"/>
-          <w:lang w:val="ru-RU"/>
         </w:rPr>
-        <w:lastRenderedPageBreak/>
         <w:t xml:space="preserve"> </w:t>
       </w:r>
       <w:r>
         <w:rPr>
           <w:rFonts w:ascii="Times New Roman" w:hAnsi="Times New Roman" w:cs="Times New Roman"/>
-          <w:sz w:val="24"/>
+          <w:sz w:val="28"/>
           <w:lang w:val="ru-RU"/>
         </w:rPr>
-        <w:t>Фактический результат прогона: зафиксировать</w:t>
+        <w:t xml:space="preserve">Фактический результат прогона: зафиксировать после выполнения команды на рабочей машине (успешно: все тесты пройдены; при ошибках — приложить вывод консоли). При недостатке </w:t>
       </w:r>
       <w:r>
         <w:rPr>
           <w:rFonts w:ascii="Times New Roman" w:hAnsi="Times New Roman" w:cs="Times New Roman"/>
-          <w:sz w:val="24"/>
+          <w:sz w:val="28"/>
           <w:lang w:val="ru-RU"/>
         </w:rPr>
-        <w:t xml:space="preserve"> после выполнения команды на рабочей машине (успешно: все тесты пройдены; при ошибках — приложить вывод консоли). При недостатке места на диске или сбое</w:t>
-      </w:r>
-      <w:r>
-        <w:rPr>
-          <w:rFonts w:ascii="Times New Roman" w:hAnsi="Times New Roman" w:cs="Times New Roman"/>
-          <w:sz w:val="24"/>
-          <w:lang w:val="ru-RU"/>
-        </w:rPr>
-        <w:t xml:space="preserve"> восстановления </w:t>
+        <w:lastRenderedPageBreak/>
+        <w:t xml:space="preserve">места на диске или сбое восстановления </w:t>
       </w:r>
       <w:proofErr w:type="spellStart"/>
       <w:r>
         <w:rPr>
           <w:rFonts w:ascii="Times New Roman" w:hAnsi="Times New Roman" w:cs="Times New Roman"/>
-          <w:sz w:val="24"/>
+          <w:sz w:val="28"/>
           <w:lang w:val="ru-RU"/>
         </w:rPr>
         <w:t>NuGet</w:t>
@@ -6171,7 +5706,7 @@
       <w:r>
         <w:rPr>
           <w:rFonts w:ascii="Times New Roman" w:hAnsi="Times New Roman" w:cs="Times New Roman"/>
-          <w:sz w:val="24"/>
+          <w:sz w:val="28"/>
           <w:lang w:val="ru-RU"/>
         </w:rPr>
         <w:t xml:space="preserve"> устранить окружение и повторить прогон.</w:t>
@@ -6187,82 +5722,26 @@
     </w:p>
     <w:p>
       <w:pPr>
-        <w:pStyle w:val="21"/>
-        <w:spacing w:before="0" w:line="360" w:lineRule="auto"/>
+        <w:spacing w:after="0" w:line="360" w:lineRule="auto"/>
+        <w:ind w:firstLine="720"/>
         <w:rPr>
           <w:rFonts w:ascii="Times New Roman" w:hAnsi="Times New Roman" w:cs="Times New Roman"/>
-          <w:color w:val="auto"/>
+          <w:b/>
           <w:sz w:val="28"/>
+          <w:szCs w:val="28"/>
           <w:lang w:val="ru-RU"/>
         </w:rPr>
       </w:pPr>
       <w:r>
         <w:rPr>
           <w:rFonts w:ascii="Times New Roman" w:hAnsi="Times New Roman" w:cs="Times New Roman"/>
-          <w:color w:val="auto"/>
+          <w:b/>
           <w:sz w:val="28"/>
+          <w:szCs w:val="28"/>
           <w:lang w:val="ru-RU"/>
         </w:rPr>
-        <w:t xml:space="preserve">6.2 </w:t>
+        <w:t>6.2 Сценарное (приёмочное) тестирование</w:t>
       </w:r>
-      <w:proofErr w:type="spellStart"/>
-      <w:r>
-        <w:rPr>
-          <w:rFonts w:ascii="Times New Roman" w:hAnsi="Times New Roman" w:cs="Times New Roman"/>
-          <w:color w:val="auto"/>
-          <w:sz w:val="28"/>
-          <w:lang w:val="ru-RU"/>
-        </w:rPr>
-        <w:t>Сценарное</w:t>
-      </w:r>
-      <w:proofErr w:type="spellEnd"/>
-      <w:r>
-        <w:rPr>
-          <w:rFonts w:ascii="Times New Roman" w:hAnsi="Times New Roman" w:cs="Times New Roman"/>
-          <w:color w:val="auto"/>
-          <w:sz w:val="28"/>
-          <w:lang w:val="ru-RU"/>
-        </w:rPr>
-        <w:t xml:space="preserve"> (</w:t>
-      </w:r>
-      <w:proofErr w:type="spellStart"/>
-      <w:r>
-        <w:rPr>
-          <w:rFonts w:ascii="Times New Roman" w:hAnsi="Times New Roman" w:cs="Times New Roman"/>
-          <w:color w:val="auto"/>
-          <w:sz w:val="28"/>
-          <w:lang w:val="ru-RU"/>
-        </w:rPr>
-        <w:t>приёмочное</w:t>
-      </w:r>
-      <w:proofErr w:type="spellEnd"/>
-      <w:r>
-        <w:rPr>
-          <w:rFonts w:ascii="Times New Roman" w:hAnsi="Times New Roman" w:cs="Times New Roman"/>
-          <w:color w:val="auto"/>
-          <w:sz w:val="28"/>
-          <w:lang w:val="ru-RU"/>
-        </w:rPr>
-        <w:t xml:space="preserve">) </w:t>
-      </w:r>
-      <w:proofErr w:type="spellStart"/>
-      <w:r>
-        <w:rPr>
-          <w:rFonts w:ascii="Times New Roman" w:hAnsi="Times New Roman" w:cs="Times New Roman"/>
-          <w:color w:val="auto"/>
-          <w:sz w:val="28"/>
-          <w:lang w:val="ru-RU"/>
-        </w:rPr>
-        <w:t>тестирование</w:t>
-      </w:r>
-      <w:proofErr w:type="spellEnd"/>
-    </w:p>
-    <w:p>
-      <w:pPr>
-        <w:rPr>
-          <w:rFonts w:ascii="Times New Roman" w:hAnsi="Times New Roman" w:cs="Times New Roman"/>
-        </w:rPr>
-      </w:pPr>
     </w:p>
     <w:tbl>
       <w:tblPr>
@@ -6413,13 +5892,8 @@
     </w:tbl>
     <w:p>
       <w:pPr>
-        <w:rPr>
-          <w:rFonts w:ascii="Times New Roman" w:hAnsi="Times New Roman" w:cs="Times New Roman"/>
-        </w:rPr>
-      </w:pPr>
-    </w:p>
-    <w:p>
-      <w:pPr>
+        <w:spacing w:after="0" w:line="360" w:lineRule="auto"/>
+        <w:ind w:firstLine="720"/>
         <w:rPr>
           <w:rFonts w:ascii="Times New Roman" w:hAnsi="Times New Roman" w:cs="Times New Roman"/>
           <w:sz w:val="28"/>
@@ -6432,31 +5906,7 @@
           <w:sz w:val="28"/>
           <w:lang w:val="ru-RU"/>
         </w:rPr>
-        <w:t>В до</w:t>
-      </w:r>
-      <w:r>
-        <w:rPr>
-          <w:rFonts w:ascii="Times New Roman" w:hAnsi="Times New Roman" w:cs="Times New Roman"/>
-          <w:sz w:val="28"/>
-          <w:lang w:val="ru-RU"/>
-        </w:rPr>
-        <w:t>кументе перечислены: 5 автоматических</w:t>
-      </w:r>
-      <w:r>
-        <w:rPr>
-          <w:rFonts w:ascii="Times New Roman" w:hAnsi="Times New Roman" w:cs="Times New Roman"/>
-          <w:sz w:val="28"/>
-          <w:lang w:val="ru-RU"/>
-        </w:rPr>
-        <w:t xml:space="preserve"> сценариев по времени изменения и 30 ручных</w:t>
-      </w:r>
-      <w:r>
-        <w:rPr>
-          <w:rFonts w:ascii="Times New Roman" w:hAnsi="Times New Roman" w:cs="Times New Roman"/>
-          <w:sz w:val="28"/>
-          <w:lang w:val="ru-RU"/>
-        </w:rPr>
-        <w:t xml:space="preserve"> сценариев по функциям (вход, клиент, модератор, мастер, администратор). Колонка «фактический результат» заполняется после прогона.</w:t>
+        <w:t>В документе перечислены: 5 автоматических сценариев по времени изменения и 30 ручных сценариев по функциям (вход, клиент, модератор, мастер, администратор). Колонка «фактический результат» заполняется после прогона.</w:t>
       </w:r>
     </w:p>
     <w:p>
@@ -6469,42 +5919,26 @@
     </w:p>
     <w:p>
       <w:pPr>
-        <w:pStyle w:val="21"/>
-        <w:spacing w:before="0" w:line="360" w:lineRule="auto"/>
+        <w:spacing w:after="0" w:line="360" w:lineRule="auto"/>
+        <w:ind w:firstLine="720"/>
         <w:rPr>
           <w:rFonts w:ascii="Times New Roman" w:hAnsi="Times New Roman" w:cs="Times New Roman"/>
-          <w:color w:val="auto"/>
+          <w:b/>
           <w:sz w:val="28"/>
+          <w:szCs w:val="28"/>
           <w:lang w:val="ru-RU"/>
         </w:rPr>
       </w:pPr>
       <w:r>
         <w:rPr>
           <w:rFonts w:ascii="Times New Roman" w:hAnsi="Times New Roman" w:cs="Times New Roman"/>
-          <w:color w:val="auto"/>
+          <w:b/>
           <w:sz w:val="28"/>
+          <w:szCs w:val="28"/>
           <w:lang w:val="ru-RU"/>
         </w:rPr>
-        <w:t xml:space="preserve">6.3 </w:t>
+        <w:t>6.3 Вывод</w:t>
       </w:r>
-      <w:proofErr w:type="spellStart"/>
-      <w:r>
-        <w:rPr>
-          <w:rFonts w:ascii="Times New Roman" w:hAnsi="Times New Roman" w:cs="Times New Roman"/>
-          <w:color w:val="auto"/>
-          <w:sz w:val="28"/>
-          <w:lang w:val="ru-RU"/>
-        </w:rPr>
-        <w:t>Вывод</w:t>
-      </w:r>
-      <w:proofErr w:type="spellEnd"/>
-    </w:p>
-    <w:p>
-      <w:pPr>
-        <w:rPr>
-          <w:rFonts w:ascii="Times New Roman" w:hAnsi="Times New Roman" w:cs="Times New Roman"/>
-        </w:rPr>
-      </w:pPr>
     </w:p>
     <w:tbl>
       <w:tblPr>
@@ -6757,6 +6191,8 @@
     </w:p>
     <w:p>
       <w:pPr>
+        <w:spacing w:after="0" w:line="360" w:lineRule="auto"/>
+        <w:ind w:firstLine="720"/>
         <w:rPr>
           <w:rFonts w:ascii="Times New Roman" w:hAnsi="Times New Roman" w:cs="Times New Roman"/>
           <w:sz w:val="28"/>
@@ -18722,7 +18158,7 @@
 </file>
 
 <file path=customXml/itemProps1.xml><?xml version="1.0" encoding="utf-8"?>
-<ds:datastoreItem xmlns:ds="http://schemas.openxmlformats.org/officeDocument/2006/customXml" ds:itemID="{4EB09D91-AA17-4E3F-A640-8958B7F2AD70}">
+<ds:datastoreItem xmlns:ds="http://schemas.openxmlformats.org/officeDocument/2006/customXml" ds:itemID="{68BAAE9C-85C9-4CAA-91A0-4958CBE7ED33}">
   <ds:schemaRefs>
     <ds:schemaRef ds:uri="http://schemas.openxmlformats.org/officeDocument/2006/bibliography"/>
   </ds:schemaRefs>

</xml_diff>